<commit_message>
Yayın: yüklenici unvanı MAHMUT TARI - MARFEN, antet yer tutucuları kaldırıldı
Co-Authored-By: Claude Opus 5 <noreply@anthropic.com>
Claude-Session: https://claude.ai/code/session_01HJPp6bx7wepUX5p8fxGcjg
</commit_message>
<xml_diff>
--- a/belgeler/26_TEKLIF_DAVET_MEKTUBU_RESMI.docx
+++ b/belgeler/26_TEKLIF_DAVET_MEKTUBU_RESMI.docx
@@ -16,23 +16,6 @@
           <w:szCs w:val="17"/>
         </w:rPr>
         <w:t xml:space="preserve">MUSAB EDER</w:t>
-      </w:r>
-    </w:p>
-    <w:p>
-      <w:pPr>
-        <w:spacing w:after="80" w:before="0" w:line="264"/>
-        <w:jc w:val="both"/>
-      </w:pPr>
-      <w:r>
-        <w:rPr>
-          <w:rFonts w:ascii="Calibri" w:cs="Calibri" w:eastAsia="Calibri" w:hAnsi="Calibri"/>
-          <w:b w:val="false"/>
-          <w:bCs w:val="false"/>
-          <w:color w:val="555555"/>
-          <w:sz w:val="15"/>
-          <w:szCs w:val="15"/>
-        </w:rPr>
-        <w:t xml:space="preserve">&lt;Başvuru sahibinin adı ve (varsa) anteti&gt;</w:t>
       </w:r>
     </w:p>
     <w:p>

</xml_diff>

<commit_message>
Yayın: firma künyesi (sicil, Mersis, telefon, e-posta) bütün belgelerde
Co-Authored-By: Claude Opus 5 <noreply@anthropic.com>
Claude-Session: https://claude.ai/code/session_01HJPp6bx7wepUX5p8fxGcjg
</commit_message>
<xml_diff>
--- a/belgeler/26_TEKLIF_DAVET_MEKTUBU_RESMI.docx
+++ b/belgeler/26_TEKLIF_DAVET_MEKTUBU_RESMI.docx
@@ -138,11 +138,10 @@
             <w:r>
               <w:rPr>
                 <w:rFonts w:ascii="Calibri" w:cs="Calibri" w:eastAsia="Calibri" w:hAnsi="Calibri"/>
-                <w:color w:val="AAAAAA"/>
                 <w:sz w:val="15"/>
                 <w:szCs w:val="15"/>
               </w:rPr>
-              <w:t xml:space="preserve">…………………………………………</w:t>
+              <w:t xml:space="preserve">MAHMUT TARI MAFREN MÜHENDİSLİK DANIŞMANLIK HİZMETLERİ</w:t>
             </w:r>
           </w:p>
         </w:tc>
@@ -208,33 +207,222 @@
             <w:r>
               <w:rPr>
                 <w:rFonts w:ascii="Calibri" w:cs="Calibri" w:eastAsia="Calibri" w:hAnsi="Calibri"/>
-                <w:color w:val="AAAAAA"/>
                 <w:sz w:val="15"/>
                 <w:szCs w:val="15"/>
               </w:rPr>
-              <w:t xml:space="preserve">…………………………………………</w:t>
+              <w:t xml:space="preserve">Şehitler Mah. 416. Sk. No: 2 İç Kapı No: 1 Gölcük / KOCAELİ</w:t>
+            </w:r>
+          </w:p>
+        </w:tc>
+      </w:tr>
+      <w:tr>
+        <w:tc>
+          <w:tcPr>
+            <w:tcW w:type="dxa" w:w="2948"/>
+            <w:tcBorders>
+              <w:top w:val="single" w:color="808080" w:sz="4"/>
+              <w:left w:val="single" w:color="808080" w:sz="4"/>
+              <w:bottom w:val="single" w:color="808080" w:sz="4"/>
+              <w:right w:val="single" w:color="808080" w:sz="4"/>
+            </w:tcBorders>
+            <w:shd w:fill="EDEDED" w:color="auto" w:val="clear"/>
+            <w:tcMar>
+              <w:top w:type="dxa" w:w="40"/>
+              <w:left w:type="dxa" w:w="60"/>
+              <w:bottom w:type="dxa" w:w="40"/>
+              <w:right w:type="dxa" w:w="60"/>
+            </w:tcMar>
+            <w:vAlign w:val="top"/>
+          </w:tcPr>
+          <w:p>
+            <w:pPr>
+              <w:spacing w:after="0" w:before="0"/>
+              <w:jc w:val="left"/>
+            </w:pPr>
+            <w:r>
+              <w:rPr>
+                <w:rFonts w:ascii="Calibri" w:cs="Calibri" w:eastAsia="Calibri" w:hAnsi="Calibri"/>
+                <w:b/>
+                <w:bCs/>
+                <w:sz w:val="15"/>
+                <w:szCs w:val="15"/>
+              </w:rPr>
+              <w:t xml:space="preserve">Ticaret sicil no</w:t>
+            </w:r>
+          </w:p>
+        </w:tc>
+        <w:tc>
+          <w:tcPr>
+            <w:tcW w:type="dxa" w:w="7483"/>
+            <w:tcBorders>
+              <w:top w:val="single" w:color="808080" w:sz="4"/>
+              <w:left w:val="single" w:color="808080" w:sz="4"/>
+              <w:bottom w:val="single" w:color="808080" w:sz="4"/>
+              <w:right w:val="single" w:color="808080" w:sz="4"/>
+            </w:tcBorders>
+            <w:tcMar>
+              <w:top w:type="dxa" w:w="40"/>
+              <w:left w:type="dxa" w:w="60"/>
+              <w:bottom w:type="dxa" w:w="40"/>
+              <w:right w:type="dxa" w:w="60"/>
+            </w:tcMar>
+            <w:vAlign w:val="top"/>
+          </w:tcPr>
+          <w:p>
+            <w:pPr>
+              <w:spacing w:after="0" w:before="0"/>
+              <w:jc w:val="left"/>
+            </w:pPr>
+            <w:r>
+              <w:rPr>
+                <w:rFonts w:ascii="Calibri" w:cs="Calibri" w:eastAsia="Calibri" w:hAnsi="Calibri"/>
+                <w:sz w:val="15"/>
+                <w:szCs w:val="15"/>
+              </w:rPr>
+              <w:t xml:space="preserve">Gölcük/6196</w:t>
+            </w:r>
+          </w:p>
+        </w:tc>
+      </w:tr>
+      <w:tr>
+        <w:tc>
+          <w:tcPr>
+            <w:tcW w:type="dxa" w:w="2948"/>
+            <w:tcBorders>
+              <w:top w:val="single" w:color="808080" w:sz="4"/>
+              <w:left w:val="single" w:color="808080" w:sz="4"/>
+              <w:bottom w:val="single" w:color="808080" w:sz="4"/>
+              <w:right w:val="single" w:color="808080" w:sz="4"/>
+            </w:tcBorders>
+            <w:shd w:fill="EDEDED" w:color="auto" w:val="clear"/>
+            <w:tcMar>
+              <w:top w:type="dxa" w:w="40"/>
+              <w:left w:type="dxa" w:w="60"/>
+              <w:bottom w:type="dxa" w:w="40"/>
+              <w:right w:type="dxa" w:w="60"/>
+            </w:tcMar>
+            <w:vAlign w:val="top"/>
+          </w:tcPr>
+          <w:p>
+            <w:pPr>
+              <w:spacing w:after="0" w:before="0"/>
+              <w:jc w:val="left"/>
+            </w:pPr>
+            <w:r>
+              <w:rPr>
+                <w:rFonts w:ascii="Calibri" w:cs="Calibri" w:eastAsia="Calibri" w:hAnsi="Calibri"/>
+                <w:b/>
+                <w:bCs/>
+                <w:sz w:val="15"/>
+                <w:szCs w:val="15"/>
+              </w:rPr>
+              <w:t xml:space="preserve">Telefon</w:t>
+            </w:r>
+          </w:p>
+        </w:tc>
+        <w:tc>
+          <w:tcPr>
+            <w:tcW w:type="dxa" w:w="7483"/>
+            <w:tcBorders>
+              <w:top w:val="single" w:color="808080" w:sz="4"/>
+              <w:left w:val="single" w:color="808080" w:sz="4"/>
+              <w:bottom w:val="single" w:color="808080" w:sz="4"/>
+              <w:right w:val="single" w:color="808080" w:sz="4"/>
+            </w:tcBorders>
+            <w:tcMar>
+              <w:top w:type="dxa" w:w="40"/>
+              <w:left w:type="dxa" w:w="60"/>
+              <w:bottom w:type="dxa" w:w="40"/>
+              <w:right w:type="dxa" w:w="60"/>
+            </w:tcMar>
+            <w:vAlign w:val="top"/>
+          </w:tcPr>
+          <w:p>
+            <w:pPr>
+              <w:spacing w:after="0" w:before="0"/>
+              <w:jc w:val="left"/>
+            </w:pPr>
+            <w:r>
+              <w:rPr>
+                <w:rFonts w:ascii="Calibri" w:cs="Calibri" w:eastAsia="Calibri" w:hAnsi="Calibri"/>
+                <w:sz w:val="15"/>
+                <w:szCs w:val="15"/>
+              </w:rPr>
+              <w:t xml:space="preserve">0541 553 66 86</w:t>
+            </w:r>
+          </w:p>
+        </w:tc>
+      </w:tr>
+      <w:tr>
+        <w:tc>
+          <w:tcPr>
+            <w:tcW w:type="dxa" w:w="2948"/>
+            <w:tcBorders>
+              <w:top w:val="single" w:color="808080" w:sz="4"/>
+              <w:left w:val="single" w:color="808080" w:sz="4"/>
+              <w:bottom w:val="single" w:color="808080" w:sz="4"/>
+              <w:right w:val="single" w:color="808080" w:sz="4"/>
+            </w:tcBorders>
+            <w:shd w:fill="EDEDED" w:color="auto" w:val="clear"/>
+            <w:tcMar>
+              <w:top w:type="dxa" w:w="40"/>
+              <w:left w:type="dxa" w:w="60"/>
+              <w:bottom w:type="dxa" w:w="40"/>
+              <w:right w:type="dxa" w:w="60"/>
+            </w:tcMar>
+            <w:vAlign w:val="top"/>
+          </w:tcPr>
+          <w:p>
+            <w:pPr>
+              <w:spacing w:after="0" w:before="0"/>
+              <w:jc w:val="left"/>
+            </w:pPr>
+            <w:r>
+              <w:rPr>
+                <w:rFonts w:ascii="Calibri" w:cs="Calibri" w:eastAsia="Calibri" w:hAnsi="Calibri"/>
+                <w:b/>
+                <w:bCs/>
+                <w:sz w:val="15"/>
+                <w:szCs w:val="15"/>
+              </w:rPr>
+              <w:t xml:space="preserve">E-posta</w:t>
+            </w:r>
+          </w:p>
+        </w:tc>
+        <w:tc>
+          <w:tcPr>
+            <w:tcW w:type="dxa" w:w="7483"/>
+            <w:tcBorders>
+              <w:top w:val="single" w:color="808080" w:sz="4"/>
+              <w:left w:val="single" w:color="808080" w:sz="4"/>
+              <w:bottom w:val="single" w:color="808080" w:sz="4"/>
+              <w:right w:val="single" w:color="808080" w:sz="4"/>
+            </w:tcBorders>
+            <w:tcMar>
+              <w:top w:type="dxa" w:w="40"/>
+              <w:left w:type="dxa" w:w="60"/>
+              <w:bottom w:type="dxa" w:w="40"/>
+              <w:right w:type="dxa" w:w="60"/>
+            </w:tcMar>
+            <w:vAlign w:val="top"/>
+          </w:tcPr>
+          <w:p>
+            <w:pPr>
+              <w:spacing w:after="0" w:before="0"/>
+              <w:jc w:val="left"/>
+            </w:pPr>
+            <w:r>
+              <w:rPr>
+                <w:rFonts w:ascii="Calibri" w:cs="Calibri" w:eastAsia="Calibri" w:hAnsi="Calibri"/>
+                <w:sz w:val="15"/>
+                <w:szCs w:val="15"/>
+              </w:rPr>
+              <w:t xml:space="preserve">mahmuttari@gmail.com</w:t>
             </w:r>
           </w:p>
         </w:tc>
       </w:tr>
     </w:tbl>
-    <w:p>
-      <w:pPr>
-        <w:spacing w:after="80" w:before="0" w:line="264"/>
-        <w:jc w:val="both"/>
-      </w:pPr>
-      <w:r>
-        <w:rPr>
-          <w:rFonts w:ascii="Calibri" w:cs="Calibri" w:eastAsia="Calibri" w:hAnsi="Calibri"/>
-          <w:b w:val="false"/>
-          <w:bCs w:val="false"/>
-          <w:color w:val="555555"/>
-          <w:sz w:val="15"/>
-          <w:szCs w:val="15"/>
-        </w:rPr>
-        <w:t xml:space="preserve">&lt;Teklif daveti göndereceğiniz firma / kişi ve adresini mutlaka yazınız&gt;</w:t>
-      </w:r>
-    </w:p>
     <w:p>
       <w:pPr>
         <w:spacing w:after="84" w:before="0"/>

</xml_diff>